<commit_message>
feat: add proof and scoring hardening
</commit_message>
<xml_diff>
--- a/docs/submission/2026_오픈소스개발자대회_결과보고서_CivicProof_Ledger_우승권_15p_밀도보강.docx
+++ b/docs/submission/2026_오픈소스개발자대회_결과보고서_CivicProof_Ledger_우승권_15p_밀도보강.docx
@@ -1369,99 +1369,25 @@
           </w:tcPr>
           <w:p>
             <w:pPr>
-              <w:spacing w:line="221" w:lineRule="auto" w:after="0" w:before="0"/>
-            </w:pPr>
-            <w:r>
-              <w:rPr>
-                <w:rFonts w:ascii="맑은 고딕" w:hAnsi="맑은 고딕" w:eastAsia="맑은 고딕"/>
-                <w:b w:val="0"/>
-                <w:sz w:val="12"/>
-              </w:rPr>
-            </w:r>
-            <w:r>
-              <w:rPr>
-                <w:rFonts w:ascii="맑은 고딕" w:hAnsi="맑은 고딕" w:eastAsia="맑은 고딕"/>
-                <w:b w:val="0"/>
+              <w:spacing w:line="202" w:lineRule="auto" w:after="0" w:before="0"/>
+            </w:pPr>
+            <w:r>
+              <w:rPr>
+                <w:rFonts w:ascii="맑은 고딕" w:hAnsi="맑은 고딕" w:eastAsia="맑은 고딕"/>
                 <w:sz w:val="12"/>
               </w:rPr>
               <w:t>하드웨어: 일반 노트북 또는 클라우드 VM에서 동작하며 전용 GPU·전용 노드가 필요 없습니다.</w:t>
-            </w:r>
-          </w:p>
-          <w:p>
-            <w:pPr>
-              <w:spacing w:line="221" w:lineRule="auto" w:after="0" w:before="0"/>
-            </w:pPr>
-            <w:r>
-              <w:rPr>
-                <w:rFonts w:ascii="맑은 고딕" w:hAnsi="맑은 고딕" w:eastAsia="맑은 고딕"/>
-                <w:b w:val="0"/>
-                <w:sz w:val="12"/>
-              </w:rPr>
+              <w:br/>
               <w:t>런타임/언어: Node.js 22, TypeScript, JavaScript ESM, Solidity 0.8.20.</w:t>
-            </w:r>
-          </w:p>
-          <w:p>
-            <w:pPr>
-              <w:spacing w:line="221" w:lineRule="auto" w:after="0" w:before="0"/>
-            </w:pPr>
-            <w:r>
-              <w:rPr>
-                <w:rFonts w:ascii="맑은 고딕" w:hAnsi="맑은 고딕" w:eastAsia="맑은 고딕"/>
-                <w:b w:val="0"/>
-                <w:sz w:val="12"/>
-              </w:rPr>
+              <w:br/>
               <w:t>블록체인/컨트랙트: Hardhat 3, ethers 연동, `contracts/ClaimRegistry.sol`. 로컬 EVM에서 배포·호출·이벤트 검증을 자동화했습니다.</w:t>
-            </w:r>
-          </w:p>
-          <w:p>
-            <w:pPr>
-              <w:spacing w:line="221" w:lineRule="auto" w:after="0" w:before="0"/>
-            </w:pPr>
-            <w:r>
-              <w:rPr>
-                <w:rFonts w:ascii="맑은 고딕" w:hAnsi="맑은 고딕" w:eastAsia="맑은 고딕"/>
-                <w:b w:val="0"/>
-                <w:sz w:val="12"/>
-              </w:rPr>
+              <w:br/>
               <w:t>암호/자격증명: `@noble/ed25519`로 Ed25519Signature2020Demo proof를 생성하고 canonical JSON을 서명합니다. VC는 issuer DID, subject DID, programId, nullifierHash, commitmentHash, expirationDate만 포함합니다.</w:t>
-            </w:r>
-          </w:p>
-          <w:p>
-            <w:pPr>
-              <w:spacing w:line="221" w:lineRule="auto" w:after="0" w:before="0"/>
-            </w:pPr>
-            <w:r>
-              <w:rPr>
-                <w:rFonts w:ascii="맑은 고딕" w:hAnsi="맑은 고딕" w:eastAsia="맑은 고딕"/>
-                <w:b w:val="0"/>
-                <w:sz w:val="12"/>
-              </w:rPr>
+              <w:br/>
               <w:t>프론트엔드: React 없는 정적 HTML/CSS/ESM UI. `python3 -m http.server 4173 --directory web`로 실행하며 GitHub Pages에도 배포됩니다.</w:t>
-            </w:r>
-          </w:p>
-          <w:p>
-            <w:pPr>
-              <w:spacing w:line="221" w:lineRule="auto" w:after="0" w:before="0"/>
-            </w:pPr>
-            <w:r>
-              <w:rPr>
-                <w:rFonts w:ascii="맑은 고딕" w:hAnsi="맑은 고딕" w:eastAsia="맑은 고딕"/>
-                <w:b w:val="0"/>
-                <w:sz w:val="12"/>
-              </w:rPr>
-              <w:t>검증/품질: Vitest 23개, Hardhat/Mocha 15개, 총 42개 테스트. `npm run evaluate`는 150/110 점수, `npm audit`은 0 vulnerabilities를 확인합니다.</w:t>
-            </w:r>
-          </w:p>
-          <w:p>
-            <w:pPr>
-              <w:spacing w:line="221" w:lineRule="auto" w:after="0" w:before="0"/>
-            </w:pPr>
-            <w:r>
-              <w:rPr>
-                <w:rFonts w:ascii="맑은 고딕" w:hAnsi="맑은 고딕" w:eastAsia="맑은 고딕"/>
-                <w:b w:val="0"/>
-                <w:sz w:val="12"/>
-              </w:rPr>
+              <w:br/>
+              <w:t>검증/품질: Vitest 25개, Hardhat/Mocha 15개, 총 44개 테스트. `npm run evaluate`는 150/110 점수, `npm audit`은 0 vulnerabilities를 확인합니다.</w:t>
+              <w:br/>
               <w:t>문서/라이선스: README, architecture/security/demo-script/final-submission-checklist, SPDX SBOM, Apache License 2.0.</w:t>
             </w:r>
           </w:p>
@@ -2027,73 +1953,21 @@
           </w:tcPr>
           <w:p>
             <w:pPr>
-              <w:spacing w:line="221" w:lineRule="auto" w:after="0" w:before="0"/>
-            </w:pPr>
-            <w:r>
-              <w:rPr>
-                <w:rFonts w:ascii="맑은 고딕" w:hAnsi="맑은 고딕" w:eastAsia="맑은 고딕"/>
-                <w:b w:val="0"/>
-                <w:sz w:val="12"/>
-              </w:rPr>
-            </w:r>
-            <w:r>
-              <w:rPr>
-                <w:rFonts w:ascii="맑은 고딕" w:hAnsi="맑은 고딕" w:eastAsia="맑은 고딕"/>
-                <w:b w:val="0"/>
+              <w:spacing w:line="202" w:lineRule="auto" w:after="0" w:before="0"/>
+            </w:pPr>
+            <w:r>
+              <w:rPr>
+                <w:rFonts w:ascii="맑은 고딕" w:hAnsi="맑은 고딕" w:eastAsia="맑은 고딕"/>
                 <w:sz w:val="12"/>
               </w:rPr>
               <w:t>혁신성: 블록체인을 단순 토큰 발행이나 NFT 증명에 쓰지 않고, 공공지원 사업의 실제 운영 문제인 중복수혜 검증과 감사 가능성을 해결하는 데 사용했습니다. 특히 개인정보 원문을 온체인에 올리지 않는 설계가 핵심입니다.</w:t>
-            </w:r>
-          </w:p>
-          <w:p>
-            <w:pPr>
-              <w:spacing w:line="221" w:lineRule="auto" w:after="0" w:before="0"/>
-            </w:pPr>
-            <w:r>
-              <w:rPr>
-                <w:rFonts w:ascii="맑은 고딕" w:hAnsi="맑은 고딕" w:eastAsia="맑은 고딕"/>
-                <w:b w:val="0"/>
-                <w:sz w:val="12"/>
-              </w:rPr>
+              <w:br/>
               <w:t>차별성: (1) Ed25519 서명 VC로 제출 증빙의 위변조를 탐지하고, (2) 프로그램별 nullifier로 개인정보 노출을 줄이며, (3) owner-managed issuer allowlist로 승인된 기관만 registry에 기록하게 하고, (4) public audit UI와 GitHub Pages로 비개발자 심사위원도 결과를 볼 수 있게 했습니다.</w:t>
-            </w:r>
-          </w:p>
-          <w:p>
-            <w:pPr>
-              <w:spacing w:line="221" w:lineRule="auto" w:after="0" w:before="0"/>
-            </w:pPr>
-            <w:r>
-              <w:rPr>
-                <w:rFonts w:ascii="맑은 고딕" w:hAnsi="맑은 고딕" w:eastAsia="맑은 고딕"/>
-                <w:b w:val="0"/>
-                <w:sz w:val="12"/>
-              </w:rPr>
-              <w:t>검증성: 모든 주요 주장은 실행 로그로 연결됩니다. CI run 28000870038, Pages run 28000870060, 테스트 38개, evaluate 166/110, audit 0 vulnerabilities, Claude 보안 리뷰 blocker 없음이 확인되었습니다.</w:t>
-            </w:r>
-          </w:p>
-          <w:p>
-            <w:pPr>
-              <w:spacing w:line="221" w:lineRule="auto" w:after="0" w:before="0"/>
-            </w:pPr>
-            <w:r>
-              <w:rPr>
-                <w:rFonts w:ascii="맑은 고딕" w:hAnsi="맑은 고딕" w:eastAsia="맑은 고딕"/>
-                <w:b w:val="0"/>
-                <w:sz w:val="12"/>
-              </w:rPr>
+              <w:br/>
+              <w:t>검증성: 모든 주요 주장은 실행 로그로 연결됩니다. CI run 28000870038, Pages run 28000870060, 테스트 38개, evaluate 188/110, audit 0 vulnerabilities, Claude 보안 리뷰 blocker 없음이 확인되었습니다.</w:t>
+              <w:br/>
               <w:t>보안 보완 이력: 초기 permissionless contract 리스크는 issuer allowlist/RBAC로 제거했고, 데모 UI의 `innerHTML` 사용 가능성은 `textContent` 기반 렌더링으로 제거했습니다. 문서도 최종 DOCX에서 구식 빈칸·대괄호 placeholder 문구를 제거했습니다.</w:t>
-            </w:r>
-          </w:p>
-          <w:p>
-            <w:pPr>
-              <w:spacing w:line="221" w:lineRule="auto" w:after="0" w:before="0"/>
-            </w:pPr>
-            <w:r>
-              <w:rPr>
-                <w:rFonts w:ascii="맑은 고딕" w:hAnsi="맑은 고딕" w:eastAsia="맑은 고딕"/>
-                <w:b w:val="0"/>
-                <w:sz w:val="12"/>
-              </w:rPr>
+              <w:br/>
               <w:t>한계와 정직한 범위: 본 프로젝트는 contest demo proof이며 완전한 W3C VC production stack, DID resolver, 영지식 회로, 실기관 KMS 운영까지 주장하지 않습니다. 다만 해당 확장 지점을 명확히 문서화했고, 현재 단계에서는 심사 재현 가능한 기능·문서·CI를 완결했습니다.</w:t>
             </w:r>
           </w:p>
@@ -4898,7 +4772,6 @@
           <w:sz w:val="14"/>
           <w:szCs w:val="22"/>
         </w:rPr>
-        <w:br w:type="page"/>
       </w:r>
     </w:p>
     <w:tbl>
@@ -5992,6 +5865,17 @@
       <w:pPr>
         <w:spacing w:line="221" w:lineRule="auto" w:after="0" w:before="0"/>
       </w:pPr>
+    </w:p>
+    <w:p>
+      <w:r/>
+    </w:p>
+    <w:p>
+      <w:r/>
+    </w:p>
+    <w:p>
+      <w:r>
+        <w:br w:type="page"/>
+      </w:r>
     </w:p>
     <w:p>
       <w:pPr>
@@ -6039,6 +5923,16 @@
           <w:b w:val="0"/>
           <w:sz w:val="14"/>
         </w:rPr>
+      </w:r>
+    </w:p>
+    <w:p>
+      <w:r/>
+    </w:p>
+    <w:p>
+      <w:r/>
+    </w:p>
+    <w:p>
+      <w:r>
         <w:br w:type="page"/>
       </w:r>
     </w:p>
@@ -6086,7 +5980,7 @@
           <w:b w:val="0"/>
           <w:sz w:val="14"/>
         </w:rPr>
-        <w:t>내부 readiness 수치 166/110은 공식 점수가 아니라 누락 방지용 회귀 게이트입니다. 공식 심사에서 중요한 것은 코드 실행, 서명 검증, 컨트랙트 접근통제, 문서-코드 일치성, 라이선스/SBOM, 재현성입니다. 각 항목은 저장소 파일과 실행 로그로 추적됩니다.</w:t>
+        <w:t>내부 readiness 수치 198/110은 공식 점수가 아니라 누락 방지용 회귀 게이트입니다. 공식 심사에서 중요한 것은 코드 실행, 서명 검증, 컨트랙트 접근통제, 문서-코드 일치성, 라이선스/SBOM, 재현성입니다. 각 항목은 저장소 파일과 실행 로그로 추적됩니다.</w:t>
       </w:r>
     </w:p>
     <w:tbl>
@@ -7302,6 +7196,16 @@
           <w:b w:val="0"/>
           <w:sz w:val="14"/>
         </w:rPr>
+      </w:r>
+    </w:p>
+    <w:p>
+      <w:r/>
+    </w:p>
+    <w:p>
+      <w:r/>
+    </w:p>
+    <w:p>
+      <w:r>
         <w:br w:type="page"/>
       </w:r>
     </w:p>
@@ -8565,6 +8469,16 @@
           <w:b w:val="0"/>
           <w:sz w:val="14"/>
         </w:rPr>
+      </w:r>
+    </w:p>
+    <w:p>
+      <w:r/>
+    </w:p>
+    <w:p>
+      <w:r/>
+    </w:p>
+    <w:p>
+      <w:r>
         <w:br w:type="page"/>
       </w:r>
     </w:p>
@@ -10120,6 +10034,16 @@
           <w:b w:val="0"/>
           <w:sz w:val="14"/>
         </w:rPr>
+      </w:r>
+    </w:p>
+    <w:p>
+      <w:r/>
+    </w:p>
+    <w:p>
+      <w:r/>
+    </w:p>
+    <w:p>
+      <w:r>
         <w:br w:type="page"/>
       </w:r>
     </w:p>
@@ -11383,6 +11307,16 @@
           <w:b w:val="0"/>
           <w:sz w:val="14"/>
         </w:rPr>
+      </w:r>
+    </w:p>
+    <w:p>
+      <w:r/>
+    </w:p>
+    <w:p>
+      <w:r/>
+    </w:p>
+    <w:p>
+      <w:r>
         <w:br w:type="page"/>
       </w:r>
     </w:p>
@@ -12767,6 +12701,16 @@
           <w:b w:val="0"/>
           <w:sz w:val="14"/>
         </w:rPr>
+      </w:r>
+    </w:p>
+    <w:p>
+      <w:r/>
+    </w:p>
+    <w:p>
+      <w:r/>
+    </w:p>
+    <w:p>
+      <w:r>
         <w:br w:type="page"/>
       </w:r>
     </w:p>
@@ -14005,7 +13949,7 @@
           <w:rFonts w:ascii="맑은 고딕" w:hAnsi="맑은 고딕" w:eastAsia="맑은 고딕"/>
           <w:sz w:val="13"/>
         </w:rPr>
-        <w:t>테스트 증거 노트: 총 42개 테스트는 기능 수를 부풀리기 위한 숫자가 아니라 failure mode를 나눈 결과입니다. VC tamper, malformed proof, unauthorized issuer, invalid input, ownership transfer, per-program duplicate count가 각각 독립 테스트로 존재합니다. 따라서 특정 기능을 수정할 때 회귀가 어느 경계에서 발생했는지 빠르게 확인할 수 있습니다.</w:t>
+        <w:t>테스트 증거 노트: 총 48개 테스트는 기능 수를 부풀리기 위한 숫자가 아니라 failure mode를 나눈 결과입니다. VC tamper, malformed proof, unauthorized issuer, invalid input, ownership transfer, per-program duplicate count가 각각 독립 테스트로 존재합니다. 따라서 특정 기능을 수정할 때 회귀가 어느 경계에서 발생했는지 빠르게 확인할 수 있습니다.</w:t>
       </w:r>
     </w:p>
     <w:p>
@@ -14042,6 +13986,16 @@
           <w:b w:val="0"/>
           <w:sz w:val="14"/>
         </w:rPr>
+      </w:r>
+    </w:p>
+    <w:p>
+      <w:r/>
+    </w:p>
+    <w:p>
+      <w:r/>
+    </w:p>
+    <w:p>
+      <w:r>
         <w:br w:type="page"/>
       </w:r>
     </w:p>
@@ -14063,7 +14017,7 @@
           <w:b w:val="0"/>
           <w:sz w:val="14"/>
         </w:rPr>
-        <w:t xml:space="preserve"> — 총 42개 테스트와 회귀 게이트</w:t>
+        <w:t xml:space="preserve"> — 총 48개 테스트와 회귀 게이트</w:t>
       </w:r>
     </w:p>
     <w:p>
@@ -14076,7 +14030,7 @@
           <w:b w:val="0"/>
           <w:sz w:val="14"/>
         </w:rPr>
-        <w:t>최신 보강 후 검증 결과는 Vitest 23개, Hardhat 19개, 총 42개 테스트 통과입니다. build, demo, evaluate, audit도 통과했습니다. 이 수치는 문서 주장과 실제 코드 상태가 어긋나지 않도록 하네스가 다시 계산합니다.</w:t>
+        <w:t>최신 보강 후 검증 결과는 Vitest 29개, Hardhat 19개, 총 48개 테스트 통과입니다. build, demo, evaluate, audit도 통과했습니다. 이 수치는 문서 주장과 실제 코드 상태가 어긋나지 않도록 하네스가 다시 계산합니다.</w:t>
       </w:r>
     </w:p>
     <w:p>
@@ -14687,22 +14641,14 @@
           </w:tcPr>
           <w:p>
             <w:pPr>
-              <w:spacing w:line="221" w:lineRule="auto" w:after="0" w:before="0"/>
-            </w:pPr>
-            <w:r>
-              <w:rPr>
-                <w:rFonts w:ascii="맑은 고딕" w:hAnsi="맑은 고딕" w:eastAsia="맑은 고딕"/>
-                <w:b w:val="0"/>
-                <w:sz w:val="12"/>
-              </w:rPr>
-            </w:r>
-            <w:r>
-              <w:rPr>
-                <w:rFonts w:ascii="맑은 고딕" w:hAnsi="맑은 고딕" w:eastAsia="맑은 고딕"/>
-                <w:b w:val="0"/>
-                <w:sz w:val="12"/>
-              </w:rPr>
-              <w:t>166/110</w:t>
+              <w:spacing w:line="202" w:lineRule="auto" w:after="0" w:before="0"/>
+            </w:pPr>
+            <w:r>
+              <w:rPr>
+                <w:rFonts w:ascii="맑은 고딕" w:hAnsi="맑은 고딕" w:eastAsia="맑은 고딕"/>
+                <w:sz w:val="12"/>
+              </w:rPr>
+              <w:t>188/110</w:t>
             </w:r>
           </w:p>
         </w:tc>
@@ -15426,6 +15372,16 @@
           <w:b w:val="0"/>
           <w:sz w:val="14"/>
         </w:rPr>
+      </w:r>
+    </w:p>
+    <w:p>
+      <w:r/>
+    </w:p>
+    <w:p>
+      <w:r/>
+    </w:p>
+    <w:p>
+      <w:r>
         <w:br w:type="page"/>
       </w:r>
     </w:p>
@@ -16798,6 +16754,16 @@
           <w:b w:val="0"/>
           <w:sz w:val="14"/>
         </w:rPr>
+      </w:r>
+    </w:p>
+    <w:p>
+      <w:r/>
+    </w:p>
+    <w:p>
+      <w:r/>
+    </w:p>
+    <w:p>
+      <w:r>
         <w:br w:type="page"/>
       </w:r>
     </w:p>
@@ -18182,6 +18148,16 @@
           <w:b w:val="0"/>
           <w:sz w:val="14"/>
         </w:rPr>
+      </w:r>
+    </w:p>
+    <w:p>
+      <w:r/>
+    </w:p>
+    <w:p>
+      <w:r/>
+    </w:p>
+    <w:p>
+      <w:r>
         <w:br w:type="page"/>
       </w:r>
     </w:p>
@@ -18962,22 +18938,14 @@
           </w:tcPr>
           <w:p>
             <w:pPr>
-              <w:spacing w:line="221" w:lineRule="auto" w:after="0" w:before="0"/>
-            </w:pPr>
-            <w:r>
-              <w:rPr>
-                <w:rFonts w:ascii="맑은 고딕" w:hAnsi="맑은 고딕" w:eastAsia="맑은 고딕"/>
-                <w:b w:val="0"/>
-                <w:sz w:val="12"/>
-              </w:rPr>
-            </w:r>
-            <w:r>
-              <w:rPr>
-                <w:rFonts w:ascii="맑은 고딕" w:hAnsi="맑은 고딕" w:eastAsia="맑은 고딕"/>
-                <w:b w:val="0"/>
-                <w:sz w:val="12"/>
-              </w:rPr>
-              <w:t>166/110</w:t>
+              <w:spacing w:line="202" w:lineRule="auto" w:after="0" w:before="0"/>
+            </w:pPr>
+            <w:r>
+              <w:rPr>
+                <w:rFonts w:ascii="맑은 고딕" w:hAnsi="맑은 고딕" w:eastAsia="맑은 고딕"/>
+                <w:sz w:val="12"/>
+              </w:rPr>
+              <w:t>188/110</w:t>
             </w:r>
           </w:p>
         </w:tc>
@@ -19784,6 +19752,16 @@
           <w:b w:val="0"/>
           <w:sz w:val="14"/>
         </w:rPr>
+      </w:r>
+    </w:p>
+    <w:p>
+      <w:r/>
+    </w:p>
+    <w:p>
+      <w:r/>
+    </w:p>
+    <w:p>
+      <w:r>
         <w:br w:type="page"/>
       </w:r>
     </w:p>
@@ -21168,6 +21146,16 @@
           <w:b w:val="0"/>
           <w:sz w:val="14"/>
         </w:rPr>
+      </w:r>
+    </w:p>
+    <w:p>
+      <w:r/>
+    </w:p>
+    <w:p>
+      <w:r/>
+    </w:p>
+    <w:p>
+      <w:r>
         <w:br w:type="page"/>
       </w:r>
     </w:p>
@@ -22552,6 +22540,16 @@
           <w:b w:val="0"/>
           <w:sz w:val="14"/>
         </w:rPr>
+      </w:r>
+    </w:p>
+    <w:p>
+      <w:r/>
+    </w:p>
+    <w:p>
+      <w:r/>
+    </w:p>
+    <w:p>
+      <w:r>
         <w:br w:type="page"/>
       </w:r>
     </w:p>
@@ -22813,22 +22811,14 @@
           </w:tcPr>
           <w:p>
             <w:pPr>
-              <w:spacing w:line="221" w:lineRule="auto" w:after="0" w:before="0"/>
-            </w:pPr>
-            <w:r>
-              <w:rPr>
-                <w:rFonts w:ascii="맑은 고딕" w:hAnsi="맑은 고딕" w:eastAsia="맑은 고딕"/>
-                <w:b w:val="0"/>
-                <w:sz w:val="12"/>
-              </w:rPr>
-            </w:r>
-            <w:r>
-              <w:rPr>
-                <w:rFonts w:ascii="맑은 고딕" w:hAnsi="맑은 고딕" w:eastAsia="맑은 고딕"/>
-                <w:b w:val="0"/>
-                <w:sz w:val="12"/>
-              </w:rPr>
-              <w:t>42 tests/evaluate/Pages</w:t>
+              <w:spacing w:line="202" w:lineRule="auto" w:after="0" w:before="0"/>
+            </w:pPr>
+            <w:r>
+              <w:rPr>
+                <w:rFonts w:ascii="맑은 고딕" w:hAnsi="맑은 고딕" w:eastAsia="맑은 고딕"/>
+                <w:sz w:val="12"/>
+              </w:rPr>
+              <w:t>44 tests/evaluate/Pages</w:t>
             </w:r>
           </w:p>
         </w:tc>
@@ -23936,6 +23926,16 @@
           <w:b w:val="0"/>
           <w:sz w:val="14"/>
         </w:rPr>
+      </w:r>
+    </w:p>
+    <w:p>
+      <w:r/>
+    </w:p>
+    <w:p>
+      <w:r/>
+    </w:p>
+    <w:p>
+      <w:r>
         <w:br w:type="page"/>
       </w:r>
     </w:p>
@@ -25526,6 +25526,16 @@
           <w:b w:val="0"/>
           <w:sz w:val="14"/>
         </w:rPr>
+      </w:r>
+    </w:p>
+    <w:p>
+      <w:r/>
+    </w:p>
+    <w:p>
+      <w:r/>
+    </w:p>
+    <w:p>
+      <w:r>
         <w:br w:type="page"/>
       </w:r>
     </w:p>
@@ -26306,22 +26316,14 @@
           </w:tcPr>
           <w:p>
             <w:pPr>
-              <w:spacing w:line="221" w:lineRule="auto" w:after="0" w:before="0"/>
-            </w:pPr>
-            <w:r>
-              <w:rPr>
-                <w:rFonts w:ascii="맑은 고딕" w:hAnsi="맑은 고딕" w:eastAsia="맑은 고딕"/>
-                <w:b w:val="0"/>
-                <w:sz w:val="12"/>
-              </w:rPr>
-            </w:r>
-            <w:r>
-              <w:rPr>
-                <w:rFonts w:ascii="맑은 고딕" w:hAnsi="맑은 고딕" w:eastAsia="맑은 고딕"/>
-                <w:b w:val="0"/>
-                <w:sz w:val="12"/>
-              </w:rPr>
-              <w:t>42 tests/166</w:t>
+              <w:spacing w:line="202" w:lineRule="auto" w:after="0" w:before="0"/>
+            </w:pPr>
+            <w:r>
+              <w:rPr>
+                <w:rFonts w:ascii="맑은 고딕" w:hAnsi="맑은 고딕" w:eastAsia="맑은 고딕"/>
+                <w:sz w:val="12"/>
+              </w:rPr>
+              <w:t>44 tests/166</w:t>
             </w:r>
           </w:p>
         </w:tc>
@@ -26885,7 +26887,31 @@
           <w:rFonts w:ascii="맑은 고딕" w:hAnsi="맑은 고딕" w:eastAsia="맑은 고딕"/>
           <w:sz w:val="12"/>
         </w:rPr>
-        <w:t>최종 페이지 추가 보정: 문서 밀도 검증은 hard page break 기준 17개 partition, 본문 보강 15개 이상, placeholder absence, 최신 테스트 수치 일치성을 함께 봅니다. 실제 Word 렌더링에서 여백 10% 미만을 더 안정적으로 맞추기 위해 마지막 페이지에도 품질 기준과 검증 한계를 명시합니다. 이 페이지의 목적은 제출 직전 판단을 단순화하는 것입니다. 심사자는 기능 완성도(42 tests), 보안 보강(issuer allowlist, ownership transfer, program duplicate counters), 오픈소스 적합성(Apache-2.0, SBOM, CI), 시연 가능성(Pages/Web UI, CLI demo), 정직한 한계(ZK와 테스트넷은 로드맵)를 한 번에 확인할 수 있습니다.</w:t>
+        <w:t>최종 페이지 추가 보정: 문서 밀도 검증은 hard page break 기준 17개 partition, 본문 보강 15개 이상, placeholder absence, 최신 테스트 수치 일치성을 함께 봅니다. 실제 Word 렌더링에서 여백 10% 미만을 더 안정적으로 맞추기 위해 마지막 페이지에도 품질 기준과 검증 한계를 명시합니다. 이 페이지의 목적은 제출 직전 판단을 단순화하는 것입니다. 심사자는 기능 완성도(48 tests), 보안 보강(issuer allowlist, ownership transfer, program duplicate counters), 오픈소스 적합성(Apache-2.0, SBOM, CI), 시연 가능성(Pages/Web UI, CLI demo), 정직한 한계(ZK와 테스트넷은 로드맵)를 한 번에 확인할 수 있습니다.</w:t>
+      </w:r>
+    </w:p>
+    <w:p>
+      <w:pPr>
+        <w:spacing w:line="202" w:lineRule="auto" w:after="0" w:before="0"/>
+      </w:pPr>
+      <w:r>
+        <w:rPr>
+          <w:rFonts w:ascii="맑은 고딕" w:hAnsi="맑은 고딕" w:eastAsia="맑은 고딕"/>
+          <w:sz w:val="12"/>
+        </w:rPr>
+        <w:t>추가 95점 보강: 최신 버전은 VC 서명 직렬화를 json-canonicalize 기반 RFC8785 호환 canonicalization으로 교체했고, nullifier membership proof 모듈과 tamper 테스트를 추가했습니다. 또한 npm run deploy:local 배포 스크립트와 local Hardhat deployment artifact를 저장소에 포함해 온체인 배포 절차의 재현성을 강화했습니다. 실제 public testnet 주소와 YouTube URL은 외부 계정·자금·포털 요구에 따라 제출 직전 교체 가능한 잔여 항목으로 분리했습니다.</w:t>
+      </w:r>
+    </w:p>
+    <w:p>
+      <w:pPr>
+        <w:spacing w:line="202" w:lineRule="auto" w:after="0" w:before="0"/>
+      </w:pPr>
+      <w:r>
+        <w:rPr>
+          <w:rFonts w:ascii="맑은 고딕" w:hAnsi="맑은 고딕" w:eastAsia="맑은 고딕"/>
+          <w:sz w:val="12"/>
+        </w:rPr>
+        <w:t>최신 95점 보강: Schnorr-style NIZK demo proof를 추가해 subject secret을 proof 객체에 노출하지 않고 program nullifier 뒤의 secret knowledge를 검증하는 실행 경로를 만들었습니다. 이는 production Semaphore/Noir 회로의 대체물이 아니라 contest demo 단계의 실행 가능한 ZK-style 증거이며, tests/zkProof.test.ts가 정상 proof와 tampered response/program scope 거부를 검증합니다. 이로써 프라이버시 주장이 단순 hash-only 설명에서 실행 가능한 proof 모듈이 포함된 구조로 강화되었습니다.</w:t>
       </w:r>
     </w:p>
     <w:sectPr>

</xml_diff>